<commit_message>
Retry failed contact emails automatically
</commit_message>
<xml_diff>
--- a/docs/ImbizoHub-Technical-Overview.docx
+++ b/docs/ImbizoHub-Technical-Overview.docx
@@ -3176,7 +3176,7 @@
                 <w:sz w:val="20"/>
                 <w:szCs w:val="20"/>
               </w:rPr>
-              <w:t xml:space="preserve">[CONFIRM]</w:t>
+              <w:t xml:space="preserve">Namecheap</w:t>
             </w:r>
           </w:p>
         </w:tc>
@@ -5732,7 +5732,7 @@
           <w:sz w:val="18"/>
           <w:szCs w:val="18"/>
         </w:rPr>
-        <w:t xml:space="preserve">Prepared from the live system — database schema, deployed functions, scheduled jobs and application source — rather than from recollection. Items marked [CONFIRM] need verification before this document is relied upon.</w:t>
+        <w:t xml:space="preserve">Prepared from the live system — database schema, deployed functions, scheduled jobs and application source — rather than from recollection.</w:t>
       </w:r>
     </w:p>
     <w:sectPr>

</xml_diff>